<commit_message>
Zoom the site map in, keep labels apart, and align phone numbers
- Use a fractional zoom so the unit and site features fill the site
  map; the area map still shows the wider context
- Place pin and line names where they don't cover pins or other names,
  trying each side of the pin, then the diagonals, then other segments of
  the line
- Set Date Created to the export date
- Line up phone numbers in one column on notification and contact rows
  that have a name (template adds markers before "Phone:"; the app adds a
  tab stop); empty rows keep the original blank lines
</commit_message>
<xml_diff>
--- a/burn-plan-template.docx
+++ b/burn-plan-template.docx
@@ -3358,7 +3358,15 @@
           <w:sz w:val="24"/>
           <w:szCs w:val="24"/>
         </w:rPr>
-        <w:t xml:space="preserve">  Phone:  </w:t>
+        <w:t xml:space="preserve">{{tab:nb1}}</w:t>
+      </w:r>
+      <w:r>
+        <w:rPr>
+          <w:rFonts w:ascii="Cambria" w:hAnsi="Cambria" w:cs="Times New Roman"/>
+          <w:sz w:val="24"/>
+          <w:szCs w:val="24"/>
+        </w:rPr>
+        <w:t xml:space="preserve">Phone:  </w:t>
       </w:r>
       <w:r>
         <w:rPr>
@@ -3418,7 +3426,15 @@
           <w:sz w:val="24"/>
           <w:szCs w:val="24"/>
         </w:rPr>
-        <w:t xml:space="preserve">  Phone:  </w:t>
+        <w:t xml:space="preserve">{{tab:nb2}}</w:t>
+      </w:r>
+      <w:r>
+        <w:rPr>
+          <w:rFonts w:ascii="Cambria" w:hAnsi="Cambria" w:cs="Times New Roman"/>
+          <w:sz w:val="24"/>
+          <w:szCs w:val="24"/>
+        </w:rPr>
+        <w:t xml:space="preserve">Phone:  </w:t>
       </w:r>
       <w:r>
         <w:rPr>
@@ -3478,7 +3494,15 @@
           <w:sz w:val="24"/>
           <w:szCs w:val="24"/>
         </w:rPr>
-        <w:t xml:space="preserve">  Phone:  </w:t>
+        <w:t xml:space="preserve">{{tab:nb3}}</w:t>
+      </w:r>
+      <w:r>
+        <w:rPr>
+          <w:rFonts w:ascii="Cambria" w:hAnsi="Cambria" w:cs="Times New Roman"/>
+          <w:sz w:val="24"/>
+          <w:szCs w:val="24"/>
+        </w:rPr>
+        <w:t xml:space="preserve">Phone:  </w:t>
       </w:r>
       <w:r>
         <w:rPr>
@@ -3538,7 +3562,15 @@
           <w:sz w:val="24"/>
           <w:szCs w:val="24"/>
         </w:rPr>
-        <w:t xml:space="preserve">  Phone:  </w:t>
+        <w:t xml:space="preserve">{{tab:nb4}}</w:t>
+      </w:r>
+      <w:r>
+        <w:rPr>
+          <w:rFonts w:ascii="Cambria" w:hAnsi="Cambria" w:cs="Times New Roman"/>
+          <w:sz w:val="24"/>
+          <w:szCs w:val="24"/>
+        </w:rPr>
+        <w:t xml:space="preserve">Phone:  </w:t>
       </w:r>
       <w:r>
         <w:rPr>
@@ -3598,7 +3630,15 @@
           <w:sz w:val="24"/>
           <w:szCs w:val="24"/>
         </w:rPr>
-        <w:t xml:space="preserve">  Phone:  </w:t>
+        <w:t xml:space="preserve">{{tab:nb5}}</w:t>
+      </w:r>
+      <w:r>
+        <w:rPr>
+          <w:rFonts w:ascii="Cambria" w:hAnsi="Cambria" w:cs="Times New Roman"/>
+          <w:sz w:val="24"/>
+          <w:szCs w:val="24"/>
+        </w:rPr>
+        <w:t xml:space="preserve">Phone:  </w:t>
       </w:r>
       <w:r>
         <w:rPr>
@@ -3658,7 +3698,15 @@
           <w:sz w:val="24"/>
           <w:szCs w:val="24"/>
         </w:rPr>
-        <w:t xml:space="preserve">  Phone:  </w:t>
+        <w:t xml:space="preserve">{{tab:nb6}}</w:t>
+      </w:r>
+      <w:r>
+        <w:rPr>
+          <w:rFonts w:ascii="Cambria" w:hAnsi="Cambria" w:cs="Times New Roman"/>
+          <w:sz w:val="24"/>
+          <w:szCs w:val="24"/>
+        </w:rPr>
+        <w:t xml:space="preserve">Phone:  </w:t>
       </w:r>
       <w:r>
         <w:rPr>
@@ -3741,7 +3789,15 @@
           <w:sz w:val="24"/>
           <w:szCs w:val="24"/>
         </w:rPr>
-        <w:t xml:space="preserve">  Phone:  </w:t>
+        <w:t xml:space="preserve">{{tab:preAq}}</w:t>
+      </w:r>
+      <w:r>
+        <w:rPr>
+          <w:rFonts w:ascii="Cambria" w:hAnsi="Cambria" w:cs="Times New Roman"/>
+          <w:sz w:val="24"/>
+          <w:szCs w:val="24"/>
+        </w:rPr>
+        <w:t xml:space="preserve">Phone:  </w:t>
       </w:r>
       <w:r>
         <w:rPr>
@@ -3824,7 +3880,15 @@
           <w:sz w:val="24"/>
           <w:szCs w:val="24"/>
         </w:rPr>
-        <w:t xml:space="preserve">  Phone:  </w:t>
+        <w:t xml:space="preserve">{{tab:preFire}}</w:t>
+      </w:r>
+      <w:r>
+        <w:rPr>
+          <w:rFonts w:ascii="Cambria" w:hAnsi="Cambria" w:cs="Times New Roman"/>
+          <w:sz w:val="24"/>
+          <w:szCs w:val="24"/>
+        </w:rPr>
+        <w:t xml:space="preserve">Phone:  </w:t>
       </w:r>
       <w:r>
         <w:rPr>
@@ -3962,7 +4026,15 @@
           <w:sz w:val="24"/>
           <w:szCs w:val="24"/>
         </w:rPr>
-        <w:t xml:space="preserve">  Phone:  </w:t>
+        <w:t xml:space="preserve">{{tab:ecc}}</w:t>
+      </w:r>
+      <w:r>
+        <w:rPr>
+          <w:rFonts w:ascii="Cambria" w:hAnsi="Cambria" w:cs="Times New Roman"/>
+          <w:sz w:val="24"/>
+          <w:szCs w:val="24"/>
+        </w:rPr>
+        <w:t xml:space="preserve">Phone:  </w:t>
       </w:r>
       <w:r>
         <w:rPr>
@@ -4045,7 +4117,15 @@
           <w:sz w:val="24"/>
           <w:szCs w:val="24"/>
         </w:rPr>
-        <w:t xml:space="preserve">  Phone:  </w:t>
+        <w:t xml:space="preserve">{{tab:dayAq}}</w:t>
+      </w:r>
+      <w:r>
+        <w:rPr>
+          <w:rFonts w:ascii="Cambria" w:hAnsi="Cambria" w:cs="Times New Roman"/>
+          <w:sz w:val="24"/>
+          <w:szCs w:val="24"/>
+        </w:rPr>
+        <w:t xml:space="preserve">Phone:  </w:t>
       </w:r>
       <w:r>
         <w:rPr>
@@ -4128,7 +4208,15 @@
           <w:sz w:val="24"/>
           <w:szCs w:val="24"/>
         </w:rPr>
-        <w:t xml:space="preserve">  Phone:  </w:t>
+        <w:t xml:space="preserve">{{tab:dayFire}}</w:t>
+      </w:r>
+      <w:r>
+        <w:rPr>
+          <w:rFonts w:ascii="Cambria" w:hAnsi="Cambria" w:cs="Times New Roman"/>
+          <w:sz w:val="24"/>
+          <w:szCs w:val="24"/>
+        </w:rPr>
+        <w:t xml:space="preserve">Phone:  </w:t>
       </w:r>
       <w:r>
         <w:rPr>
@@ -4211,7 +4299,15 @@
           <w:sz w:val="24"/>
           <w:szCs w:val="24"/>
         </w:rPr>
-        <w:t xml:space="preserve">  Phone:  </w:t>
+        <w:t xml:space="preserve">{{tab:oth1}}</w:t>
+      </w:r>
+      <w:r>
+        <w:rPr>
+          <w:rFonts w:ascii="Cambria" w:hAnsi="Cambria" w:cs="Times New Roman"/>
+          <w:sz w:val="24"/>
+          <w:szCs w:val="24"/>
+        </w:rPr>
+        <w:t xml:space="preserve">Phone:  </w:t>
       </w:r>
       <w:r>
         <w:rPr>
@@ -4271,7 +4367,15 @@
           <w:sz w:val="24"/>
           <w:szCs w:val="24"/>
         </w:rPr>
-        <w:t xml:space="preserve">  Phone:  </w:t>
+        <w:t xml:space="preserve">{{tab:oth2}}</w:t>
+      </w:r>
+      <w:r>
+        <w:rPr>
+          <w:rFonts w:ascii="Cambria" w:hAnsi="Cambria" w:cs="Times New Roman"/>
+          <w:sz w:val="24"/>
+          <w:szCs w:val="24"/>
+        </w:rPr>
+        <w:t xml:space="preserve">Phone:  </w:t>
       </w:r>
       <w:r>
         <w:rPr>
@@ -4331,7 +4435,15 @@
           <w:sz w:val="24"/>
           <w:szCs w:val="24"/>
         </w:rPr>
-        <w:t xml:space="preserve">  Phone:  </w:t>
+        <w:t xml:space="preserve">{{tab:oth3}}</w:t>
+      </w:r>
+      <w:r>
+        <w:rPr>
+          <w:rFonts w:ascii="Cambria" w:hAnsi="Cambria" w:cs="Times New Roman"/>
+          <w:sz w:val="24"/>
+          <w:szCs w:val="24"/>
+        </w:rPr>
+        <w:t xml:space="preserve">Phone:  </w:t>
       </w:r>
       <w:r>
         <w:rPr>
@@ -4481,7 +4593,15 @@
           <w:sz w:val="24"/>
           <w:szCs w:val="24"/>
         </w:rPr>
-        <w:t xml:space="preserve">  Phone/frequency:  </w:t>
+        <w:t xml:space="preserve">{{tab:wc1}}</w:t>
+      </w:r>
+      <w:r>
+        <w:rPr>
+          <w:rFonts w:ascii="Cambria" w:hAnsi="Cambria" w:cs="Times New Roman"/>
+          <w:sz w:val="24"/>
+          <w:szCs w:val="24"/>
+        </w:rPr>
+        <w:t xml:space="preserve">Phone/frequency:  </w:t>
       </w:r>
       <w:r>
         <w:rPr>
@@ -4525,7 +4645,15 @@
           <w:sz w:val="24"/>
           <w:szCs w:val="24"/>
         </w:rPr>
-        <w:t xml:space="preserve">  Phone/frequency:  </w:t>
+        <w:t xml:space="preserve">{{tab:wc2}}</w:t>
+      </w:r>
+      <w:r>
+        <w:rPr>
+          <w:rFonts w:ascii="Cambria" w:hAnsi="Cambria" w:cs="Times New Roman"/>
+          <w:sz w:val="24"/>
+          <w:szCs w:val="24"/>
+        </w:rPr>
+        <w:t xml:space="preserve">Phone/frequency:  </w:t>
       </w:r>
       <w:r>
         <w:rPr>
@@ -4569,7 +4697,15 @@
           <w:sz w:val="24"/>
           <w:szCs w:val="24"/>
         </w:rPr>
-        <w:t xml:space="preserve">  Phone/frequency:  </w:t>
+        <w:t xml:space="preserve">{{tab:wc3}}</w:t>
+      </w:r>
+      <w:r>
+        <w:rPr>
+          <w:rFonts w:ascii="Cambria" w:hAnsi="Cambria" w:cs="Times New Roman"/>
+          <w:sz w:val="24"/>
+          <w:szCs w:val="24"/>
+        </w:rPr>
+        <w:t xml:space="preserve">Phone/frequency:  </w:t>
       </w:r>
       <w:r>
         <w:rPr>

</xml_diff>